<commit_message>
Upload of SRS Document, UML Diagrams and their descriptions.
</commit_message>
<xml_diff>
--- a/SRS/Software Report v1.0.docx
+++ b/SRS/Software Report v1.0.docx
@@ -172,6 +172,20 @@
         </w:rPr>
         <w:t>v1</w:t>
       </w:r>
+      <w:r>
+        <w:rPr>
+          <w:rFonts w:asciiTheme="majorBidi" w:eastAsia="Times New Roman" w:hAnsiTheme="majorBidi" w:cstheme="majorBidi"/>
+          <w:b/>
+          <w:bCs/>
+          <w:color w:val="0000FF"/>
+          <w:kern w:val="0"/>
+          <w:sz w:val="20"/>
+          <w:szCs w:val="20"/>
+          <w:lang w:eastAsia="en-GB"/>
+          <w14:ligatures w14:val="none"/>
+        </w:rPr>
+        <w:t>.0</w:t>
+      </w:r>
     </w:p>
     <w:p>
       <w:pPr>
@@ -213,24 +227,8 @@
           <w:lang w:eastAsia="en-GB"/>
           <w14:ligatures w14:val="none"/>
         </w:rPr>
-        <w:t xml:space="preserve">Mustafa </w:t>
-      </w:r>
-      <w:proofErr w:type="spellStart"/>
-      <w:r>
-        <w:rPr>
-          <w:rFonts w:asciiTheme="majorBidi" w:eastAsia="Times New Roman" w:hAnsiTheme="majorBidi" w:cstheme="majorBidi"/>
-          <w:b/>
-          <w:bCs/>
-          <w:color w:val="0000FF"/>
-          <w:kern w:val="0"/>
-          <w:sz w:val="20"/>
-          <w:szCs w:val="20"/>
-          <w:lang w:eastAsia="en-GB"/>
-          <w14:ligatures w14:val="none"/>
-        </w:rPr>
-        <w:t>Cilek</w:t>
-      </w:r>
-      <w:proofErr w:type="spellEnd"/>
+        <w:t>Mustafa Cilek</w:t>
+      </w:r>
     </w:p>
     <w:p>
       <w:pPr>
@@ -601,22 +599,8 @@
                 <w:lang w:eastAsia="en-GB"/>
                 <w14:ligatures w14:val="none"/>
               </w:rPr>
-              <w:t xml:space="preserve">Mustafa </w:t>
+              <w:t>Mustafa Cilek</w:t>
             </w:r>
-            <w:proofErr w:type="spellStart"/>
-            <w:r>
-              <w:rPr>
-                <w:rFonts w:asciiTheme="majorBidi" w:eastAsia="Times New Roman" w:hAnsiTheme="majorBidi" w:cstheme="majorBidi"/>
-                <w:color w:val="0000FF"/>
-                <w:kern w:val="0"/>
-                <w:sz w:val="16"/>
-                <w:szCs w:val="16"/>
-                <w:lang w:eastAsia="en-GB"/>
-                <w14:ligatures w14:val="none"/>
-              </w:rPr>
-              <w:t>Cilek</w:t>
-            </w:r>
-            <w:proofErr w:type="spellEnd"/>
           </w:p>
         </w:tc>
         <w:tc>
@@ -697,7 +681,6 @@
                 <w14:ligatures w14:val="none"/>
               </w:rPr>
             </w:pPr>
-            <w:proofErr w:type="gramStart"/>
             <w:r>
               <w:rPr>
                 <w:rFonts w:asciiTheme="majorBidi" w:eastAsia="Times New Roman" w:hAnsiTheme="majorBidi" w:cstheme="majorBidi"/>
@@ -708,9 +691,8 @@
                 <w:lang w:eastAsia="en-GB"/>
                 <w14:ligatures w14:val="none"/>
               </w:rPr>
-              <w:t>”Initial</w:t>
+              <w:t xml:space="preserve">”Initial </w:t>
             </w:r>
-            <w:proofErr w:type="gramEnd"/>
             <w:r>
               <w:rPr>
                 <w:rFonts w:asciiTheme="majorBidi" w:eastAsia="Times New Roman" w:hAnsiTheme="majorBidi" w:cstheme="majorBidi"/>
@@ -721,7 +703,19 @@
                 <w:lang w:eastAsia="en-GB"/>
                 <w14:ligatures w14:val="none"/>
               </w:rPr>
-              <w:t xml:space="preserve"> version” </w:t>
+              <w:t>V</w:t>
+            </w:r>
+            <w:r>
+              <w:rPr>
+                <w:rFonts w:asciiTheme="majorBidi" w:eastAsia="Times New Roman" w:hAnsiTheme="majorBidi" w:cstheme="majorBidi"/>
+                <w:color w:val="0000FF"/>
+                <w:kern w:val="0"/>
+                <w:sz w:val="16"/>
+                <w:szCs w:val="16"/>
+                <w:lang w:eastAsia="en-GB"/>
+                <w14:ligatures w14:val="none"/>
+              </w:rPr>
+              <w:t xml:space="preserve">ersion” </w:t>
             </w:r>
           </w:p>
         </w:tc>
@@ -767,7 +761,31 @@
                 <w:lang w:eastAsia="en-GB"/>
                 <w14:ligatures w14:val="none"/>
               </w:rPr>
-              <w:t>V1</w:t>
+              <w:t>v</w:t>
+            </w:r>
+            <w:r>
+              <w:rPr>
+                <w:rFonts w:asciiTheme="majorBidi" w:eastAsia="Times New Roman" w:hAnsiTheme="majorBidi" w:cstheme="majorBidi"/>
+                <w:color w:val="0000FF"/>
+                <w:kern w:val="0"/>
+                <w:sz w:val="16"/>
+                <w:szCs w:val="16"/>
+                <w:lang w:eastAsia="en-GB"/>
+                <w14:ligatures w14:val="none"/>
+              </w:rPr>
+              <w:t>1</w:t>
+            </w:r>
+            <w:r>
+              <w:rPr>
+                <w:rFonts w:asciiTheme="majorBidi" w:eastAsia="Times New Roman" w:hAnsiTheme="majorBidi" w:cstheme="majorBidi"/>
+                <w:color w:val="0000FF"/>
+                <w:kern w:val="0"/>
+                <w:sz w:val="16"/>
+                <w:szCs w:val="16"/>
+                <w:lang w:eastAsia="en-GB"/>
+                <w14:ligatures w14:val="none"/>
+              </w:rPr>
+              <w:t>.0</w:t>
             </w:r>
           </w:p>
         </w:tc>
@@ -1188,22 +1206,8 @@
           <w:lang w:eastAsia="en-GB"/>
           <w14:ligatures w14:val="none"/>
         </w:rPr>
-        <w:t xml:space="preserve">«Describe any standards or typographical conventions that were followed when writing this specification, such as fonts or highlighting that have special significance. For example, state whether priorities for higher-level requirements are assumed to be inherited by detailed requirements, or whether every requirement statement is to have its own </w:t>
-      </w:r>
-      <w:proofErr w:type="gramStart"/>
-      <w:r>
-        <w:rPr>
-          <w:rFonts w:asciiTheme="majorBidi" w:eastAsia="Times New Roman" w:hAnsiTheme="majorBidi" w:cstheme="majorBidi"/>
-          <w:color w:val="0000FF"/>
-          <w:kern w:val="0"/>
-          <w:sz w:val="20"/>
-          <w:szCs w:val="20"/>
-          <w:lang w:eastAsia="en-GB"/>
-          <w14:ligatures w14:val="none"/>
-        </w:rPr>
-        <w:t>priority.»</w:t>
-      </w:r>
-      <w:proofErr w:type="gramEnd"/>
+        <w:t>«Describe any standards or typographical conventions that were followed when writing this specification, such as fonts or highlighting that have special significance. For example, state whether priorities for higher-level requirements are assumed to be inherited by detailed requirements, or whether every requirement statement is to have its own priority.»</w:t>
+      </w:r>
     </w:p>
     <w:p>
       <w:pPr>
@@ -1260,22 +1264,8 @@
           <w:lang w:eastAsia="en-GB"/>
           <w14:ligatures w14:val="none"/>
         </w:rPr>
-        <w:t xml:space="preserve">«Describe the different types of reader that the document is intended for, such as developers, project managers, marketing staff, users, testers, and documentation writers. Describe what the rest of this document contains and how it is organized. Suggest a sequence for reading the document, beginning with the overview sections and proceeding through the sections that are most pertinent to each reader </w:t>
-      </w:r>
-      <w:proofErr w:type="gramStart"/>
-      <w:r>
-        <w:rPr>
-          <w:rFonts w:asciiTheme="majorBidi" w:eastAsia="Times New Roman" w:hAnsiTheme="majorBidi" w:cstheme="majorBidi"/>
-          <w:color w:val="0000FF"/>
-          <w:kern w:val="0"/>
-          <w:sz w:val="20"/>
-          <w:szCs w:val="20"/>
-          <w:lang w:eastAsia="en-GB"/>
-          <w14:ligatures w14:val="none"/>
-        </w:rPr>
-        <w:t>type.»</w:t>
-      </w:r>
-      <w:proofErr w:type="gramEnd"/>
+        <w:t>«Describe the different types of reader that the document is intended for, such as developers, project managers, marketing staff, users, testers, and documentation writers. Describe what the rest of this document contains and how it is organized. Suggest a sequence for reading the document, beginning with the overview sections and proceeding through the sections that are most pertinent to each reader type.»</w:t>
+      </w:r>
     </w:p>
     <w:p>
       <w:pPr>
@@ -1332,22 +1322,8 @@
           <w:lang w:eastAsia="en-GB"/>
           <w14:ligatures w14:val="none"/>
         </w:rPr>
-        <w:t xml:space="preserve">«Provide a short description of the software being specified and its purpose, including relevant benefits, objectives, and goals. Relate the software to corporate goals or business strategies when </w:t>
-      </w:r>
-      <w:proofErr w:type="gramStart"/>
-      <w:r>
-        <w:rPr>
-          <w:rFonts w:asciiTheme="majorBidi" w:eastAsia="Times New Roman" w:hAnsiTheme="majorBidi" w:cstheme="majorBidi"/>
-          <w:color w:val="0000FF"/>
-          <w:kern w:val="0"/>
-          <w:sz w:val="20"/>
-          <w:szCs w:val="20"/>
-          <w:lang w:eastAsia="en-GB"/>
-          <w14:ligatures w14:val="none"/>
-        </w:rPr>
-        <w:t>applicable.»</w:t>
-      </w:r>
-      <w:proofErr w:type="gramEnd"/>
+        <w:t>«Provide a short description of the software being specified and its purpose, including relevant benefits, objectives, and goals. Relate the software to corporate goals or business strategies when applicable.»</w:t>
+      </w:r>
     </w:p>
     <w:p>
       <w:pPr>
@@ -1404,22 +1380,8 @@
           <w:lang w:eastAsia="en-GB"/>
           <w14:ligatures w14:val="none"/>
         </w:rPr>
-        <w:t xml:space="preserve">«List any other documents or Web addresses to which this document refers or was based on. These may include user interface style guides, contracts, standards, system requirements specifications, use case documents, or a vision and scope document. Provide enough information so that the reader could access a copy of each reference, including title, author, version number, date, and source or location. Include the assignment document in the </w:t>
-      </w:r>
-      <w:proofErr w:type="gramStart"/>
-      <w:r>
-        <w:rPr>
-          <w:rFonts w:asciiTheme="majorBidi" w:eastAsia="Times New Roman" w:hAnsiTheme="majorBidi" w:cstheme="majorBidi"/>
-          <w:color w:val="0000FF"/>
-          <w:kern w:val="0"/>
-          <w:sz w:val="20"/>
-          <w:szCs w:val="20"/>
-          <w:lang w:eastAsia="en-GB"/>
-          <w14:ligatures w14:val="none"/>
-        </w:rPr>
-        <w:t>references.»</w:t>
-      </w:r>
-      <w:proofErr w:type="gramEnd"/>
+        <w:t>«List any other documents or Web addresses to which this document refers or was based on. These may include user interface style guides, contracts, standards, system requirements specifications, use case documents, or a vision and scope document. Provide enough information so that the reader could access a copy of each reference, including title, author, version number, date, and source or location. Include the assignment document in the references.»</w:t>
+      </w:r>
     </w:p>
     <w:p>
       <w:pPr>
@@ -1506,22 +1468,8 @@
           <w:lang w:eastAsia="en-GB"/>
           <w14:ligatures w14:val="none"/>
         </w:rPr>
-        <w:t xml:space="preserve">«Describe the context and origin of the product being specified in this specification. For example, state whether this product is a follow-on member of a product family, a replacement for certain existing systems, or a new, self-contained </w:t>
-      </w:r>
-      <w:proofErr w:type="gramStart"/>
-      <w:r>
-        <w:rPr>
-          <w:rFonts w:asciiTheme="majorBidi" w:eastAsia="Times New Roman" w:hAnsiTheme="majorBidi" w:cstheme="majorBidi"/>
-          <w:color w:val="0000FF"/>
-          <w:kern w:val="0"/>
-          <w:sz w:val="20"/>
-          <w:szCs w:val="20"/>
-          <w:lang w:eastAsia="en-GB"/>
-          <w14:ligatures w14:val="none"/>
-        </w:rPr>
-        <w:t>product.»</w:t>
-      </w:r>
-      <w:proofErr w:type="gramEnd"/>
+        <w:t>«Describe the context and origin of the product being specified in this specification. For example, state whether this product is a follow-on member of a product family, a replacement for certain existing systems, or a new, self-contained product.»</w:t>
+      </w:r>
     </w:p>
     <w:p>
       <w:pPr>
@@ -1578,48 +1526,8 @@
           <w:lang w:eastAsia="en-GB"/>
           <w14:ligatures w14:val="none"/>
         </w:rPr>
-        <w:t xml:space="preserve">«Summarize the major features the product must perform or must let the user perform. Details will be provided in Section 3, so only a bullet list is needed here. Organize the features to make them understandable to any reader of the specification. A picture of the major groups of related requirements and how they relate, such as a </w:t>
-      </w:r>
-      <w:proofErr w:type="gramStart"/>
-      <w:r>
-        <w:rPr>
-          <w:rFonts w:asciiTheme="majorBidi" w:eastAsia="Times New Roman" w:hAnsiTheme="majorBidi" w:cstheme="majorBidi"/>
-          <w:color w:val="0000FF"/>
-          <w:kern w:val="0"/>
-          <w:sz w:val="20"/>
-          <w:szCs w:val="20"/>
-          <w:lang w:eastAsia="en-GB"/>
-          <w14:ligatures w14:val="none"/>
-        </w:rPr>
-        <w:t>top level</w:t>
-      </w:r>
-      <w:proofErr w:type="gramEnd"/>
-      <w:r>
-        <w:rPr>
-          <w:rFonts w:asciiTheme="majorBidi" w:eastAsia="Times New Roman" w:hAnsiTheme="majorBidi" w:cstheme="majorBidi"/>
-          <w:color w:val="0000FF"/>
-          <w:kern w:val="0"/>
-          <w:sz w:val="20"/>
-          <w:szCs w:val="20"/>
-          <w:lang w:eastAsia="en-GB"/>
-          <w14:ligatures w14:val="none"/>
-        </w:rPr>
-        <w:t xml:space="preserve"> data flow diagram or object class diagram, is often </w:t>
-      </w:r>
-      <w:proofErr w:type="gramStart"/>
-      <w:r>
-        <w:rPr>
-          <w:rFonts w:asciiTheme="majorBidi" w:eastAsia="Times New Roman" w:hAnsiTheme="majorBidi" w:cstheme="majorBidi"/>
-          <w:color w:val="0000FF"/>
-          <w:kern w:val="0"/>
-          <w:sz w:val="20"/>
-          <w:szCs w:val="20"/>
-          <w:lang w:eastAsia="en-GB"/>
-          <w14:ligatures w14:val="none"/>
-        </w:rPr>
-        <w:t>effective.»</w:t>
-      </w:r>
-      <w:proofErr w:type="gramEnd"/>
+        <w:t>«Summarize the major features the product must perform or must let the user perform. Details will be provided in Section 3, so only a bullet list is needed here. Organize the features to make them understandable to any reader of the specification. A picture of the major groups of related requirements and how they relate, such as a top level data flow diagram or object class diagram, is often effective.»</w:t>
+      </w:r>
     </w:p>
     <w:p>
       <w:pPr>
@@ -1750,22 +1658,8 @@
           <w14:ligatures w14:val="none"/>
         </w:rPr>
         <w:lastRenderedPageBreak/>
-        <w:t xml:space="preserve">security or privilege levels, educational level, or experience. Describe the pertinent characteristics of each user class. Certain requirements may pertain only to certain user classes. Distinguish the most important user classes for this product from those who are less important to </w:t>
-      </w:r>
-      <w:proofErr w:type="gramStart"/>
-      <w:r>
-        <w:rPr>
-          <w:rFonts w:asciiTheme="majorBidi" w:eastAsia="Times New Roman" w:hAnsiTheme="majorBidi" w:cstheme="majorBidi"/>
-          <w:color w:val="0000FF"/>
-          <w:kern w:val="0"/>
-          <w:sz w:val="20"/>
-          <w:szCs w:val="20"/>
-          <w:lang w:eastAsia="en-GB"/>
-          <w14:ligatures w14:val="none"/>
-        </w:rPr>
-        <w:t>satisfy.»</w:t>
-      </w:r>
-      <w:proofErr w:type="gramEnd"/>
+        <w:t>security or privilege levels, educational level, or experience. Describe the pertinent characteristics of each user class. Certain requirements may pertain only to certain user classes. Distinguish the most important user classes for this product from those who are less important to satisfy.»</w:t>
+      </w:r>
     </w:p>
     <w:p>
       <w:pPr>
@@ -1822,22 +1716,8 @@
           <w:lang w:eastAsia="en-GB"/>
           <w14:ligatures w14:val="none"/>
         </w:rPr>
-        <w:t xml:space="preserve">«Describe the environment in which the software will operate, including the hardware platform, operating system and versions, and any other software components or applications with which it must peacefully </w:t>
-      </w:r>
-      <w:proofErr w:type="gramStart"/>
-      <w:r>
-        <w:rPr>
-          <w:rFonts w:asciiTheme="majorBidi" w:eastAsia="Times New Roman" w:hAnsiTheme="majorBidi" w:cstheme="majorBidi"/>
-          <w:color w:val="0000FF"/>
-          <w:kern w:val="0"/>
-          <w:sz w:val="20"/>
-          <w:szCs w:val="20"/>
-          <w:lang w:eastAsia="en-GB"/>
-          <w14:ligatures w14:val="none"/>
-        </w:rPr>
-        <w:t>coexist.»</w:t>
-      </w:r>
-      <w:proofErr w:type="gramEnd"/>
+        <w:t>«Describe the environment in which the software will operate, including the hardware platform, operating system and versions, and any other software components or applications with which it must peacefully coexist.»</w:t>
+      </w:r>
     </w:p>
     <w:p>
       <w:pPr>
@@ -1952,22 +1832,8 @@
           <w:lang w:eastAsia="en-GB"/>
           <w14:ligatures w14:val="none"/>
         </w:rPr>
-        <w:t xml:space="preserve">«List the user documentation components (such as user manuals, on-line help, and tutorials) that will be delivered along with the software. Identify any known user documentation delivery formats or </w:t>
-      </w:r>
-      <w:proofErr w:type="gramStart"/>
-      <w:r>
-        <w:rPr>
-          <w:rFonts w:asciiTheme="majorBidi" w:eastAsia="Times New Roman" w:hAnsiTheme="majorBidi" w:cstheme="majorBidi"/>
-          <w:color w:val="0000FF"/>
-          <w:kern w:val="0"/>
-          <w:sz w:val="20"/>
-          <w:szCs w:val="20"/>
-          <w:lang w:eastAsia="en-GB"/>
-          <w14:ligatures w14:val="none"/>
-        </w:rPr>
-        <w:t>standards.»</w:t>
-      </w:r>
-      <w:proofErr w:type="gramEnd"/>
+        <w:t>«List the user documentation components (such as user manuals, on-line help, and tutorials) that will be delivered along with the software. Identify any known user documentation delivery formats or standards.»</w:t>
+      </w:r>
     </w:p>
     <w:p>
       <w:pPr>
@@ -2024,22 +1890,8 @@
           <w:lang w:eastAsia="en-GB"/>
           <w14:ligatures w14:val="none"/>
         </w:rPr>
-        <w:t>«List any assumed factors (as opposed to known facts) that could affect the requirements stated in the specification. These could include third-party or commercial components that you plan to use, issues around the development or operating environment, or constraints. The project could be affected if these assumptions are incorrect, are not shared, or change. Also identify any dependencies the project has on external factors, such as software components that you intend to reuse from another project, unless they are already documented elsewhere (for example, in the vision and scope document or the project plan</w:t>
-      </w:r>
-      <w:proofErr w:type="gramStart"/>
-      <w:r>
-        <w:rPr>
-          <w:rFonts w:asciiTheme="majorBidi" w:eastAsia="Times New Roman" w:hAnsiTheme="majorBidi" w:cstheme="majorBidi"/>
-          <w:color w:val="0000FF"/>
-          <w:kern w:val="0"/>
-          <w:sz w:val="20"/>
-          <w:szCs w:val="20"/>
-          <w:lang w:eastAsia="en-GB"/>
-          <w14:ligatures w14:val="none"/>
-        </w:rPr>
-        <w:t>).»</w:t>
-      </w:r>
-      <w:proofErr w:type="gramEnd"/>
+        <w:t>«List any assumed factors (as opposed to known facts) that could affect the requirements stated in the specification. These could include third-party or commercial components that you plan to use, issues around the development or operating environment, or constraints. The project could be affected if these assumptions are incorrect, are not shared, or change. Also identify any dependencies the project has on external factors, such as software components that you intend to reuse from another project, unless they are already documented elsewhere (for example, in the vision and scope document or the project plan).»</w:t>
+      </w:r>
     </w:p>
     <w:p>
       <w:pPr>
@@ -2096,22 +1948,8 @@
           <w:lang w:eastAsia="en-GB"/>
           <w14:ligatures w14:val="none"/>
         </w:rPr>
-        <w:t xml:space="preserve">«The purpose here is to give a brief introduction to the system features, so that §4 has something to reference. Then, the full explanation of the system features is given in §5, likely referencing §4. The numbering in §3 and §5 should </w:t>
-      </w:r>
-      <w:proofErr w:type="gramStart"/>
-      <w:r>
-        <w:rPr>
-          <w:rFonts w:asciiTheme="majorBidi" w:eastAsia="Times New Roman" w:hAnsiTheme="majorBidi" w:cstheme="majorBidi"/>
-          <w:color w:val="0000FF"/>
-          <w:kern w:val="0"/>
-          <w:sz w:val="20"/>
-          <w:szCs w:val="20"/>
-          <w:lang w:eastAsia="en-GB"/>
-          <w14:ligatures w14:val="none"/>
-        </w:rPr>
-        <w:t>match.»</w:t>
-      </w:r>
-      <w:proofErr w:type="gramEnd"/>
+        <w:t>«The purpose here is to give a brief introduction to the system features, so that §4 has something to reference. Then, the full explanation of the system features is given in §5, likely referencing §4. The numbering in §3 and §5 should match.»</w:t>
+      </w:r>
     </w:p>
     <w:p>
       <w:pPr>
@@ -2342,59 +2180,7 @@
           <w:lang w:eastAsia="en-GB"/>
           <w14:ligatures w14:val="none"/>
         </w:rPr>
-        <w:t xml:space="preserve">«Describe the </w:t>
-      </w:r>
-      <w:proofErr w:type="gramStart"/>
-      <w:r>
-        <w:rPr>
-          <w:rFonts w:asciiTheme="majorBidi" w:eastAsia="Times New Roman" w:hAnsiTheme="majorBidi" w:cstheme="majorBidi"/>
-          <w:color w:val="0000FF"/>
-          <w:kern w:val="0"/>
-          <w:sz w:val="20"/>
-          <w:szCs w:val="20"/>
-          <w:lang w:eastAsia="en-GB"/>
-          <w14:ligatures w14:val="none"/>
-        </w:rPr>
-        <w:t>high level</w:t>
-      </w:r>
-      <w:proofErr w:type="gramEnd"/>
-      <w:r>
-        <w:rPr>
-          <w:rFonts w:asciiTheme="majorBidi" w:eastAsia="Times New Roman" w:hAnsiTheme="majorBidi" w:cstheme="majorBidi"/>
-          <w:color w:val="0000FF"/>
-          <w:kern w:val="0"/>
-          <w:sz w:val="20"/>
-          <w:szCs w:val="20"/>
-          <w:lang w:eastAsia="en-GB"/>
-          <w14:ligatures w14:val="none"/>
-        </w:rPr>
-        <w:t xml:space="preserve"> functionality of the system from the user’s perspective. Explain how the user should be able to use your system to complete all the expected features and the feedback information that will be displayed for the user (for each screen the user will see). For example, specify whether it is GUI or </w:t>
-      </w:r>
-      <w:proofErr w:type="gramStart"/>
-      <w:r>
-        <w:rPr>
-          <w:rFonts w:asciiTheme="majorBidi" w:eastAsia="Times New Roman" w:hAnsiTheme="majorBidi" w:cstheme="majorBidi"/>
-          <w:color w:val="0000FF"/>
-          <w:kern w:val="0"/>
-          <w:sz w:val="20"/>
-          <w:szCs w:val="20"/>
-          <w:lang w:eastAsia="en-GB"/>
-          <w14:ligatures w14:val="none"/>
-        </w:rPr>
-        <w:t>text based</w:t>
-      </w:r>
-      <w:proofErr w:type="gramEnd"/>
-      <w:r>
-        <w:rPr>
-          <w:rFonts w:asciiTheme="majorBidi" w:eastAsia="Times New Roman" w:hAnsiTheme="majorBidi" w:cstheme="majorBidi"/>
-          <w:color w:val="0000FF"/>
-          <w:kern w:val="0"/>
-          <w:sz w:val="20"/>
-          <w:szCs w:val="20"/>
-          <w:lang w:eastAsia="en-GB"/>
-          <w14:ligatures w14:val="none"/>
-        </w:rPr>
-        <w:t xml:space="preserve"> interface and how at high level it would work. Discuss at high level how user will interact with the game such as clicking buttons, typing in some selection character, etc.»</w:t>
+        <w:t>«Describe the high level functionality of the system from the user’s perspective. Explain how the user should be able to use your system to complete all the expected features and the feedback information that will be displayed for the user (for each screen the user will see). For example, specify whether it is GUI or text based interface and how at high level it would work. Discuss at high level how user will interact with the game such as clicking buttons, typing in some selection character, etc.»</w:t>
       </w:r>
     </w:p>
     <w:p>
@@ -2481,22 +2267,8 @@
           <w14:ligatures w14:val="none"/>
         </w:rPr>
         <w:lastRenderedPageBreak/>
-        <w:t xml:space="preserve">«Describe the logical and physical characteristics of each interface between the software product and the hardware components of the system. This may include the supported device types, the nature of the data and control interactions between the software and the hardware, and communication protocols to be </w:t>
-      </w:r>
-      <w:proofErr w:type="gramStart"/>
-      <w:r>
-        <w:rPr>
-          <w:rFonts w:asciiTheme="majorBidi" w:eastAsia="Times New Roman" w:hAnsiTheme="majorBidi" w:cstheme="majorBidi"/>
-          <w:color w:val="0000FF"/>
-          <w:kern w:val="0"/>
-          <w:sz w:val="20"/>
-          <w:szCs w:val="20"/>
-          <w:lang w:eastAsia="en-GB"/>
-          <w14:ligatures w14:val="none"/>
-        </w:rPr>
-        <w:t>used.»</w:t>
-      </w:r>
-      <w:proofErr w:type="gramEnd"/>
+        <w:t>«Describe the logical and physical characteristics of each interface between the software product and the hardware components of the system. This may include the supported device types, the nature of the data and control interactions between the software and the hardware, and communication protocols to be used.»</w:t>
+      </w:r>
     </w:p>
     <w:p>
       <w:pPr>
@@ -2553,22 +2325,8 @@
           <w:lang w:eastAsia="en-GB"/>
           <w14:ligatures w14:val="none"/>
         </w:rPr>
-        <w:t xml:space="preserve">«Describe the connections between this product and other specific software components (name and version), including databases, interpreters, operating systems, tools, libraries, and integrated commercial components. Identify the data items or messages coming into the system and going out and describe the purpose of each. Describe the services needed and the nature of communications. Identify data that will be shared across software components. If the data sharing mechanism must be implemented in a specific way (for example, use of a global data area in a multitasking operating system), specify this as an implementation </w:t>
-      </w:r>
-      <w:proofErr w:type="gramStart"/>
-      <w:r>
-        <w:rPr>
-          <w:rFonts w:asciiTheme="majorBidi" w:eastAsia="Times New Roman" w:hAnsiTheme="majorBidi" w:cstheme="majorBidi"/>
-          <w:color w:val="0000FF"/>
-          <w:kern w:val="0"/>
-          <w:sz w:val="20"/>
-          <w:szCs w:val="20"/>
-          <w:lang w:eastAsia="en-GB"/>
-          <w14:ligatures w14:val="none"/>
-        </w:rPr>
-        <w:t>constraint.»</w:t>
-      </w:r>
-      <w:proofErr w:type="gramEnd"/>
+        <w:t>«Describe the connections between this product and other specific software components (name and version), including databases, interpreters, operating systems, tools, libraries, and integrated commercial components. Identify the data items or messages coming into the system and going out and describe the purpose of each. Describe the services needed and the nature of communications. Identify data that will be shared across software components. If the data sharing mechanism must be implemented in a specific way (for example, use of a global data area in a multitasking operating system), specify this as an implementation constraint.»</w:t>
+      </w:r>
     </w:p>
     <w:p>
       <w:pPr>
@@ -2625,22 +2383,8 @@
           <w:lang w:eastAsia="en-GB"/>
           <w14:ligatures w14:val="none"/>
         </w:rPr>
-        <w:t xml:space="preserve">«This template illustrates organizing the functional requirements for the product by system features, the major services provided by the </w:t>
-      </w:r>
-      <w:proofErr w:type="gramStart"/>
-      <w:r>
-        <w:rPr>
-          <w:rFonts w:asciiTheme="majorBidi" w:eastAsia="Times New Roman" w:hAnsiTheme="majorBidi" w:cstheme="majorBidi"/>
-          <w:color w:val="0000FF"/>
-          <w:kern w:val="0"/>
-          <w:sz w:val="20"/>
-          <w:szCs w:val="20"/>
-          <w:lang w:eastAsia="en-GB"/>
-          <w14:ligatures w14:val="none"/>
-        </w:rPr>
-        <w:t>product.»</w:t>
-      </w:r>
-      <w:proofErr w:type="gramEnd"/>
+        <w:t>«This template illustrates organizing the functional requirements for the product by system features, the major services provided by the product.»</w:t>
+      </w:r>
     </w:p>
     <w:p>
       <w:pPr>
@@ -2741,22 +2485,8 @@
           <w:lang w:eastAsia="en-GB"/>
           <w14:ligatures w14:val="none"/>
         </w:rPr>
-        <w:t xml:space="preserve">«Provide a short description of the feature. Give its priority, </w:t>
-      </w:r>
-      <w:proofErr w:type="gramStart"/>
-      <w:r>
-        <w:rPr>
-          <w:rFonts w:asciiTheme="majorBidi" w:eastAsia="Times New Roman" w:hAnsiTheme="majorBidi" w:cstheme="majorBidi"/>
-          <w:color w:val="0000FF"/>
-          <w:kern w:val="0"/>
-          <w:sz w:val="20"/>
-          <w:szCs w:val="20"/>
-          <w:lang w:eastAsia="en-GB"/>
-          <w14:ligatures w14:val="none"/>
-        </w:rPr>
-        <w:t>too.»</w:t>
-      </w:r>
-      <w:proofErr w:type="gramEnd"/>
+        <w:t>«Provide a short description of the feature. Give its priority, too.»</w:t>
+      </w:r>
     </w:p>
     <w:p>
       <w:pPr>
@@ -2803,46 +2533,18 @@
           <w14:ligatures w14:val="none"/>
         </w:rPr>
       </w:pPr>
-      <w:proofErr w:type="gramStart"/>
-      <w:r>
-        <w:rPr>
-          <w:rFonts w:asciiTheme="majorBidi" w:eastAsia="Times New Roman" w:hAnsiTheme="majorBidi" w:cstheme="majorBidi"/>
-          <w:color w:val="0000FF"/>
-          <w:kern w:val="0"/>
-          <w:sz w:val="20"/>
-          <w:szCs w:val="20"/>
-          <w:lang w:eastAsia="en-GB"/>
-          <w14:ligatures w14:val="none"/>
-        </w:rPr>
-        <w:t>«”Stimulus</w:t>
-      </w:r>
-      <w:proofErr w:type="gramEnd"/>
-      <w:r>
-        <w:rPr>
-          <w:rFonts w:asciiTheme="majorBidi" w:eastAsia="Times New Roman" w:hAnsiTheme="majorBidi" w:cstheme="majorBidi"/>
-          <w:color w:val="0000FF"/>
-          <w:kern w:val="0"/>
-          <w:sz w:val="20"/>
-          <w:szCs w:val="20"/>
-          <w:lang w:eastAsia="en-GB"/>
-          <w14:ligatures w14:val="none"/>
-        </w:rPr>
-        <w:t>” or “</w:t>
-      </w:r>
-      <w:proofErr w:type="gramStart"/>
-      <w:r>
-        <w:rPr>
-          <w:rFonts w:asciiTheme="majorBidi" w:eastAsia="Times New Roman" w:hAnsiTheme="majorBidi" w:cstheme="majorBidi"/>
-          <w:color w:val="0000FF"/>
-          <w:kern w:val="0"/>
-          <w:sz w:val="20"/>
-          <w:szCs w:val="20"/>
-          <w:lang w:eastAsia="en-GB"/>
-          <w14:ligatures w14:val="none"/>
-        </w:rPr>
-        <w:t>Condition”»</w:t>
-      </w:r>
-      <w:proofErr w:type="gramEnd"/>
+      <w:r>
+        <w:rPr>
+          <w:rFonts w:asciiTheme="majorBidi" w:eastAsia="Times New Roman" w:hAnsiTheme="majorBidi" w:cstheme="majorBidi"/>
+          <w:color w:val="0000FF"/>
+          <w:kern w:val="0"/>
+          <w:sz w:val="20"/>
+          <w:szCs w:val="20"/>
+          <w:lang w:eastAsia="en-GB"/>
+          <w14:ligatures w14:val="none"/>
+        </w:rPr>
+        <w:t>«”Stimulus” or “Condition”»</w:t>
+      </w:r>
       <w:r>
         <w:rPr>
           <w:rFonts w:asciiTheme="majorBidi" w:eastAsia="Times New Roman" w:hAnsiTheme="majorBidi" w:cstheme="majorBidi"/>
@@ -5164,23 +4866,6 @@
 </file>
 
 <file path=customXml/item1.xml><?xml version="1.0" encoding="utf-8"?>
-<p:properties xmlns:p="http://schemas.microsoft.com/office/2006/metadata/properties" xmlns:xsi="http://www.w3.org/2001/XMLSchema-instance" xmlns:pc="http://schemas.microsoft.com/office/infopath/2007/PartnerControls">
-  <documentManagement>
-    <_activity xmlns="856a555b-7bcf-44bf-889f-7d758cc2aa62" xsi:nil="true"/>
-  </documentManagement>
-</p:properties>
-</file>
-
-<file path=customXml/item2.xml><?xml version="1.0" encoding="utf-8"?>
-<?mso-contentType ?>
-<FormTemplates xmlns="http://schemas.microsoft.com/sharepoint/v3/contenttype/forms">
-  <Display>DocumentLibraryForm</Display>
-  <Edit>DocumentLibraryForm</Edit>
-  <New>DocumentLibraryForm</New>
-</FormTemplates>
-</file>
-
-<file path=customXml/item3.xml><?xml version="1.0" encoding="utf-8"?>
 <ct:contentTypeSchema xmlns:ct="http://schemas.microsoft.com/office/2006/metadata/contentType" xmlns:ma="http://schemas.microsoft.com/office/2006/metadata/properties/metaAttributes" ct:_="" ma:_="" ma:contentTypeName="Belge" ma:contentTypeID="0x010100182F6AB1A2EA1C4AA45631D9897AF83C" ma:contentTypeVersion="6" ma:contentTypeDescription="Yeni belge oluşturun." ma:contentTypeScope="" ma:versionID="b1a10ba8e4b2932e8577fd8ca283dcc3">
   <xsd:schema xmlns:xsd="http://www.w3.org/2001/XMLSchema" xmlns:xs="http://www.w3.org/2001/XMLSchema" xmlns:p="http://schemas.microsoft.com/office/2006/metadata/properties" xmlns:ns3="856a555b-7bcf-44bf-889f-7d758cc2aa62" targetNamespace="http://schemas.microsoft.com/office/2006/metadata/properties" ma:root="true" ma:fieldsID="b90204e08ef373c27f34400e6581c662" ns3:_="">
     <xsd:import namespace="856a555b-7bcf-44bf-889f-7d758cc2aa62"/>
@@ -5336,25 +5021,24 @@
 </ct:contentTypeSchema>
 </file>
 
-<file path=customXml/itemProps1.xml><?xml version="1.0" encoding="utf-8"?>
-<ds:datastoreItem xmlns:ds="http://schemas.openxmlformats.org/officeDocument/2006/customXml" ds:itemID="{EC59BCAC-5958-440D-B997-8742829F7E3D}">
-  <ds:schemaRefs>
-    <ds:schemaRef ds:uri="http://schemas.microsoft.com/office/2006/metadata/properties"/>
-    <ds:schemaRef ds:uri="http://schemas.microsoft.com/office/infopath/2007/PartnerControls"/>
-    <ds:schemaRef ds:uri="856a555b-7bcf-44bf-889f-7d758cc2aa62"/>
-  </ds:schemaRefs>
-</ds:datastoreItem>
+<file path=customXml/item2.xml><?xml version="1.0" encoding="utf-8"?>
+<?mso-contentType ?>
+<FormTemplates xmlns="http://schemas.microsoft.com/sharepoint/v3/contenttype/forms">
+  <Display>DocumentLibraryForm</Display>
+  <Edit>DocumentLibraryForm</Edit>
+  <New>DocumentLibraryForm</New>
+</FormTemplates>
 </file>
 
-<file path=customXml/itemProps2.xml><?xml version="1.0" encoding="utf-8"?>
-<ds:datastoreItem xmlns:ds="http://schemas.openxmlformats.org/officeDocument/2006/customXml" ds:itemID="{4889B075-1E53-400B-B42E-5D8679E48518}">
-  <ds:schemaRefs>
-    <ds:schemaRef ds:uri="http://schemas.microsoft.com/sharepoint/v3/contenttype/forms"/>
-  </ds:schemaRefs>
-</ds:datastoreItem>
+<file path=customXml/item3.xml><?xml version="1.0" encoding="utf-8"?>
+<p:properties xmlns:p="http://schemas.microsoft.com/office/2006/metadata/properties" xmlns:xsi="http://www.w3.org/2001/XMLSchema-instance" xmlns:pc="http://schemas.microsoft.com/office/infopath/2007/PartnerControls">
+  <documentManagement>
+    <_activity xmlns="856a555b-7bcf-44bf-889f-7d758cc2aa62" xsi:nil="true"/>
+  </documentManagement>
+</p:properties>
 </file>
 
-<file path=customXml/itemProps3.xml><?xml version="1.0" encoding="utf-8"?>
+<file path=customXml/itemProps1.xml><?xml version="1.0" encoding="utf-8"?>
 <ds:datastoreItem xmlns:ds="http://schemas.openxmlformats.org/officeDocument/2006/customXml" ds:itemID="{1E6A9E36-2757-41BD-B604-4690C29D5D37}">
   <ds:schemaRefs>
     <ds:schemaRef ds:uri="http://schemas.microsoft.com/office/2006/metadata/contentType"/>
@@ -5370,4 +5054,22 @@
     <ds:schemaRef ds:uri="http://schemas.microsoft.com/internal/obd"/>
   </ds:schemaRefs>
 </ds:datastoreItem>
+</file>
+
+<file path=customXml/itemProps2.xml><?xml version="1.0" encoding="utf-8"?>
+<ds:datastoreItem xmlns:ds="http://schemas.openxmlformats.org/officeDocument/2006/customXml" ds:itemID="{4889B075-1E53-400B-B42E-5D8679E48518}">
+  <ds:schemaRefs>
+    <ds:schemaRef ds:uri="http://schemas.microsoft.com/sharepoint/v3/contenttype/forms"/>
+  </ds:schemaRefs>
+</ds:datastoreItem>
+</file>
+
+<file path=customXml/itemProps3.xml><?xml version="1.0" encoding="utf-8"?>
+<ds:datastoreItem xmlns:ds="http://schemas.openxmlformats.org/officeDocument/2006/customXml" ds:itemID="{EC59BCAC-5958-440D-B997-8742829F7E3D}">
+  <ds:schemaRefs>
+    <ds:schemaRef ds:uri="http://schemas.microsoft.com/office/2006/metadata/properties"/>
+    <ds:schemaRef ds:uri="http://schemas.microsoft.com/office/infopath/2007/PartnerControls"/>
+    <ds:schemaRef ds:uri="856a555b-7bcf-44bf-889f-7d758cc2aa62"/>
+  </ds:schemaRefs>
+</ds:datastoreItem>
 </file>
</xml_diff>